<commit_message>
Finalize manuscript v5 and comparator recovery audit
</commit_message>
<xml_diff>
--- a/paper/0910/manuscript_v5.docx
+++ b/paper/0910/manuscript_v5.docx
@@ -183,117 +183,65 @@
     </w:p>
     <w:p>
       <w:pPr>
-        <w:keepLines/>
-        <w:spacing w:before="120" w:after="160"/>
+        <w:keepNext/>
+        <w:spacing w:before="160" w:after="40"/>
         <w:jc w:val="center"/>
       </w:pPr>
       <w:r>
-        <w:rPr>
-          <w:rFonts w:ascii="Times New Roman" w:hAnsi="Times New Roman"/>
-          <w:b/>
-          <w:color w:val="1F4E79"/>
-          <w:sz w:val="21"/>
-        </w:rPr>
-        <w:t>[INSERT FIGURE 1 NEAR HERE]</w:t>
+        <w:drawing>
+          <wp:inline xmlns:a="http://schemas.openxmlformats.org/drawingml/2006/main" xmlns:pic="http://schemas.openxmlformats.org/drawingml/2006/picture">
+            <wp:extent cx="6355080" cy="2118360"/>
+            <wp:docPr id="1" name="Picture 1"/>
+            <wp:cNvGraphicFramePr>
+              <a:graphicFrameLocks noChangeAspect="1"/>
+            </wp:cNvGraphicFramePr>
+            <a:graphic>
+              <a:graphicData uri="http://schemas.openxmlformats.org/drawingml/2006/picture">
+                <pic:pic>
+                  <pic:nvPicPr>
+                    <pic:cNvPr id="0" name="figure1_ai_biology_first_v1.png"/>
+                    <pic:cNvPicPr/>
+                  </pic:nvPicPr>
+                  <pic:blipFill>
+                    <a:blip r:embed="rId9"/>
+                    <a:stretch>
+                      <a:fillRect/>
+                    </a:stretch>
+                  </pic:blipFill>
+                  <pic:spPr>
+                    <a:xfrm>
+                      <a:off x="0" y="0"/>
+                      <a:ext cx="6355080" cy="2118360"/>
+                    </a:xfrm>
+                    <a:prstGeom prst="rect"/>
+                  </pic:spPr>
+                </pic:pic>
+              </a:graphicData>
+            </a:graphic>
+          </wp:inline>
+        </w:drawing>
       </w:r>
     </w:p>
     <w:p>
-      <w:r>
-        <w:rPr>
-          <w:rFonts w:ascii="Times New Roman" w:hAnsi="Times New Roman"/>
-        </w:rPr>
-        <w:t xml:space="preserve">Diagnostic canonical k-mers that distinguish a family from other catalogue representatives provide a read-derived abundance estimate. The same family representative is then localized in an assembly, and overlapping intervals are unioned to measure assembled repeat bases. For read-derived abundance </w:t>
-      </w:r>
-      <w:r>
-        <w:rPr>
-          <w:rFonts w:ascii="Times New Roman" w:hAnsi="Times New Roman"/>
-          <w:i/>
-        </w:rPr>
-        <w:t>R</w:t>
-      </w:r>
-      <w:r>
-        <w:rPr>
-          <w:rFonts w:ascii="Times New Roman" w:hAnsi="Times New Roman"/>
-        </w:rPr>
-        <w:t xml:space="preserve"> and assembly representation </w:t>
-      </w:r>
-      <w:r>
-        <w:rPr>
-          <w:rFonts w:ascii="Times New Roman" w:hAnsi="Times New Roman"/>
-          <w:i/>
-        </w:rPr>
-        <w:t>A</w:t>
-      </w:r>
-      <w:r>
-        <w:rPr>
-          <w:rFonts w:ascii="Times New Roman" w:hAnsi="Times New Roman"/>
-        </w:rPr>
-        <w:t xml:space="preserve">, TandemX reports </w:t>
-      </w:r>
-      <w:r>
-        <w:rPr>
-          <w:rFonts w:ascii="Times New Roman" w:hAnsi="Times New Roman"/>
-          <w:i/>
-        </w:rPr>
-        <w:t>D</w:t>
-      </w:r>
-      <w:r>
-        <w:rPr>
-          <w:rFonts w:ascii="Times New Roman" w:hAnsi="Times New Roman"/>
-        </w:rPr>
-        <w:t xml:space="preserve"> = max[</w:t>
-      </w:r>
-      <w:r>
-        <w:rPr>
-          <w:rFonts w:ascii="Times New Roman" w:hAnsi="Times New Roman"/>
-          <w:i/>
-        </w:rPr>
-        <w:t>R</w:t>
-      </w:r>
-      <w:r>
-        <w:rPr>
-          <w:rFonts w:ascii="Times New Roman" w:hAnsi="Times New Roman"/>
-        </w:rPr>
-        <w:t xml:space="preserve"> - </w:t>
-      </w:r>
-      <w:r>
-        <w:rPr>
-          <w:rFonts w:ascii="Times New Roman" w:hAnsi="Times New Roman"/>
-          <w:i/>
-        </w:rPr>
-        <w:t>A</w:t>
-      </w:r>
-      <w:r>
-        <w:rPr>
-          <w:rFonts w:ascii="Times New Roman" w:hAnsi="Times New Roman"/>
-        </w:rPr>
-        <w:t xml:space="preserve">, 0) and the ratio </w:t>
-      </w:r>
-      <w:r>
-        <w:rPr>
-          <w:rFonts w:ascii="Times New Roman" w:hAnsi="Times New Roman"/>
-          <w:i/>
-        </w:rPr>
-        <w:t>A</w:t>
-      </w:r>
-      <w:r>
-        <w:rPr>
-          <w:rFonts w:ascii="Times New Roman" w:hAnsi="Times New Roman"/>
-        </w:rPr>
-        <w:t>/</w:t>
-      </w:r>
-      <w:r>
-        <w:rPr>
-          <w:rFonts w:ascii="Times New Roman" w:hAnsi="Times New Roman"/>
-          <w:i/>
-        </w:rPr>
-        <w:t>R</w:t>
-      </w:r>
-      <w:r>
-        <w:rPr>
-          <w:rFonts w:ascii="Times New Roman" w:hAnsi="Times New Roman"/>
-        </w:rPr>
-        <w:t xml:space="preserve"> (Fig. 1C). Candidate deficits can then be tested across k-mer lengths or with independent sequencing platforms. A family with discordant measurements remains unresolved rather than contributing to a genome-wide score.</w:t>
+      <w:pPr>
+        <w:keepLines/>
+        <w:spacing w:after="160"/>
+        <w:jc w:val="left"/>
+      </w:pPr>
+      <w:r>
+        <w:rPr>
+          <w:rFonts w:ascii="Times New Roman" w:hAnsi="Times New Roman"/>
+          <w:b/>
+          <w:sz w:val="19"/>
+        </w:rPr>
+        <w:t xml:space="preserve">Figure 1. </w:t>
+      </w:r>
+      <w:r>
+        <w:rPr>
+          <w:rFonts w:ascii="Times New Roman" w:hAnsi="Times New Roman"/>
+          <w:sz w:val="19"/>
+        </w:rPr>
+        <w:t>TandemX links raw-read tandem-repeat families to assembly representation.</w:t>
       </w:r>
     </w:p>
     <w:p>
@@ -301,7 +249,106 @@
         <w:rPr>
           <w:rFonts w:ascii="Times New Roman" w:hAnsi="Times New Roman"/>
         </w:rPr>
-        <w:t>This linked family-level output is the main distinction from existing tools (Table 1). Repeat detection, repeat-unit reconstruction, assembly annotation, long-read mapping and genome-wide k-mer completeness are all established tasks. TandemX connects them around one operational family catalogue so that a reader can move directly from a read-supported family to its estimated abundance, assembly coordinates, representation ratio and evidence state (Fig. 1D).</w:t>
+        <w:t xml:space="preserve">Diagnostic canonical k-mers that distinguish a family from other catalogue representatives provide a read-derived abundance estimate. The same family representative is then localized in an assembly, and overlapping intervals are unioned to measure assembled repeat bases. For read-derived abundance </w:t>
+      </w:r>
+      <w:r>
+        <w:rPr>
+          <w:rFonts w:ascii="Times New Roman" w:hAnsi="Times New Roman"/>
+          <w:i/>
+        </w:rPr>
+        <w:t>R</w:t>
+      </w:r>
+      <w:r>
+        <w:rPr>
+          <w:rFonts w:ascii="Times New Roman" w:hAnsi="Times New Roman"/>
+        </w:rPr>
+        <w:t xml:space="preserve"> and assembly representation </w:t>
+      </w:r>
+      <w:r>
+        <w:rPr>
+          <w:rFonts w:ascii="Times New Roman" w:hAnsi="Times New Roman"/>
+          <w:i/>
+        </w:rPr>
+        <w:t>A</w:t>
+      </w:r>
+      <w:r>
+        <w:rPr>
+          <w:rFonts w:ascii="Times New Roman" w:hAnsi="Times New Roman"/>
+        </w:rPr>
+        <w:t xml:space="preserve">, TandemX reports </w:t>
+      </w:r>
+      <w:r>
+        <w:rPr>
+          <w:rFonts w:ascii="Times New Roman" w:hAnsi="Times New Roman"/>
+          <w:i/>
+        </w:rPr>
+        <w:t>D</w:t>
+      </w:r>
+      <w:r>
+        <w:rPr>
+          <w:rFonts w:ascii="Times New Roman" w:hAnsi="Times New Roman"/>
+        </w:rPr>
+        <w:t xml:space="preserve"> = max[</w:t>
+      </w:r>
+      <w:r>
+        <w:rPr>
+          <w:rFonts w:ascii="Times New Roman" w:hAnsi="Times New Roman"/>
+          <w:i/>
+        </w:rPr>
+        <w:t>R</w:t>
+      </w:r>
+      <w:r>
+        <w:rPr>
+          <w:rFonts w:ascii="Times New Roman" w:hAnsi="Times New Roman"/>
+        </w:rPr>
+        <w:t xml:space="preserve"> - </w:t>
+      </w:r>
+      <w:r>
+        <w:rPr>
+          <w:rFonts w:ascii="Times New Roman" w:hAnsi="Times New Roman"/>
+          <w:i/>
+        </w:rPr>
+        <w:t>A</w:t>
+      </w:r>
+      <w:r>
+        <w:rPr>
+          <w:rFonts w:ascii="Times New Roman" w:hAnsi="Times New Roman"/>
+        </w:rPr>
+        <w:t xml:space="preserve">, 0) and the ratio </w:t>
+      </w:r>
+      <w:r>
+        <w:rPr>
+          <w:rFonts w:ascii="Times New Roman" w:hAnsi="Times New Roman"/>
+          <w:i/>
+        </w:rPr>
+        <w:t>A</w:t>
+      </w:r>
+      <w:r>
+        <w:rPr>
+          <w:rFonts w:ascii="Times New Roman" w:hAnsi="Times New Roman"/>
+        </w:rPr>
+        <w:t>/</w:t>
+      </w:r>
+      <w:r>
+        <w:rPr>
+          <w:rFonts w:ascii="Times New Roman" w:hAnsi="Times New Roman"/>
+          <w:i/>
+        </w:rPr>
+        <w:t>R</w:t>
+      </w:r>
+      <w:r>
+        <w:rPr>
+          <w:rFonts w:ascii="Times New Roman" w:hAnsi="Times New Roman"/>
+        </w:rPr>
+        <w:t xml:space="preserve"> (Fig. 1B,C). Candidate deficits can then be tested across k-mer lengths or with independent sequencing platforms. A family with discordant measurements remains unresolved rather than contributing to a genome-wide score.</w:t>
+      </w:r>
+    </w:p>
+    <w:p>
+      <w:r>
+        <w:rPr>
+          <w:rFonts w:ascii="Times New Roman" w:hAnsi="Times New Roman"/>
+        </w:rPr>
+        <w:t>This linked family-level output is the main distinction from existing tools (Table 1). Repeat detection, repeat-unit reconstruction, assembly annotation, long-read mapping and genome-wide k-mer completeness are all established tasks. TandemX connects them around one operational family catalogue so that a reader can move directly from a read-supported family to its estimated abundance, assembly coordinates, representation ratio and evidence state (Fig. 1C).</w:t>
       </w:r>
     </w:p>
     <w:p>
@@ -1289,7 +1336,78 @@
         <w:rPr>
           <w:rFonts w:ascii="Times New Roman" w:hAnsi="Times New Roman"/>
         </w:rPr>
-        <w:t>We evaluated repeat discovery, abundance estimation and assembly localization against planted truth before combining them in a unified comparison (Fig. 2A). In a factorial 10-Mb simulation containing 55 planted families, TandemX recovered all founders from clean and high-error 5x long-read datasets. A broader validation spanning period, divergence, indels, array number and negative controls retained high array and family recovery and made no calls in the three purely negative classes. Sequence-based clustering also recovered all three related planted families in a dedicated validation.</w:t>
+        <w:t>We evaluated repeat discovery, abundance estimation and assembly localization against separate planted truth definitions before comparing tools at matched endpoints. The complete simulation design and TandemX-only validation panels are reported in the Supplementary material; the main figure is restricted to final production TandemX and external comparators. In a factorial 10-Mb simulation containing 55 planted families, TandemX recovered all founders from clean and high-error 5x long-read datasets. A broader validation spanning period, divergence, indels, array number and negative controls retained high array and family recovery and made no calls in the three purely negative classes. Sequence-based clustering also recovered all three related planted families in a dedicated validation.</w:t>
+      </w:r>
+    </w:p>
+    <w:p>
+      <w:pPr>
+        <w:keepNext/>
+        <w:spacing w:before="160" w:after="40"/>
+        <w:jc w:val="center"/>
+      </w:pPr>
+      <w:r>
+        <w:drawing>
+          <wp:inline xmlns:a="http://schemas.openxmlformats.org/drawingml/2006/main" xmlns:pic="http://schemas.openxmlformats.org/drawingml/2006/picture">
+            <wp:extent cx="6355080" cy="2601986"/>
+            <wp:docPr id="2" name="Picture 2"/>
+            <wp:cNvGraphicFramePr>
+              <a:graphicFrameLocks noChangeAspect="1"/>
+            </wp:cNvGraphicFramePr>
+            <a:graphic>
+              <a:graphicData uri="http://schemas.openxmlformats.org/drawingml/2006/picture">
+                <pic:pic>
+                  <pic:nvPicPr>
+                    <pic:cNvPr id="0" name="figure2_v3_1_production_only_preview.png"/>
+                    <pic:cNvPicPr/>
+                  </pic:nvPicPr>
+                  <pic:blipFill>
+                    <a:blip r:embed="rId10"/>
+                    <a:stretch>
+                      <a:fillRect/>
+                    </a:stretch>
+                  </pic:blipFill>
+                  <pic:spPr>
+                    <a:xfrm>
+                      <a:off x="0" y="0"/>
+                      <a:ext cx="6355080" cy="2601986"/>
+                    </a:xfrm>
+                    <a:prstGeom prst="rect"/>
+                  </pic:spPr>
+                </pic:pic>
+              </a:graphicData>
+            </a:graphic>
+          </wp:inline>
+        </w:drawing>
+      </w:r>
+    </w:p>
+    <w:p>
+      <w:pPr>
+        <w:keepLines/>
+        <w:spacing w:after="160"/>
+        <w:jc w:val="left"/>
+      </w:pPr>
+      <w:r>
+        <w:rPr>
+          <w:rFonts w:ascii="Times New Roman" w:hAnsi="Times New Roman"/>
+          <w:b/>
+          <w:sz w:val="19"/>
+        </w:rPr>
+        <w:t xml:space="preserve">Figure 2. </w:t>
+      </w:r>
+      <w:r>
+        <w:rPr>
+          <w:rFonts w:ascii="Times New Roman" w:hAnsi="Times New Roman"/>
+          <w:sz w:val="19"/>
+        </w:rPr>
+        <w:t>Endpoint-matched comparisons define the analytical scope of TandemX.</w:t>
+      </w:r>
+    </w:p>
+    <w:p>
+      <w:r>
+        <w:rPr>
+          <w:rFonts w:ascii="Times New Roman" w:hAnsi="Times New Roman"/>
+        </w:rPr>
+        <w:t>We next measured how discovery changed from 0.5x to 30x in nested read sets from three independently generated 10-Mb validation genomes (Supplementary Fig. S1; Supplementary Tables S3 and S4). Median operational-family count increased from 34 at 0.5x to 55 at 5x and 58 at 30x, whereas the median number of unique candidate monomers continued to increase from 36 to 119. All 55 planted families, including the 20-copy low-abundance tier, were recovered in every genome at 5x, and no additional planted family was recovered at higher depth. Under the pre-specified catalogue criterion, 5x--10x and 10x--20x both had a new-family fraction below 0.05 and a family-level Jaccard above 0.95 in all three genomes; 20x was therefore the first operational saturation depth. The 20x--30x transition also passed in all genomes. This result separates early recovery of the planted families from the more conservative stabilization of the complete operational catalogue.</w:t>
       </w:r>
     </w:p>
     <w:p>
@@ -1305,7 +1423,7 @@
           <w:color w:val="1F4E79"/>
           <w:sz w:val="21"/>
         </w:rPr>
-        <w:t>[INSERT FIGURE 2 NEAR HERE]</w:t>
+        <w:t>Supplementary Figure S1 is placed in the Supplementary Figures file; its complete legend appears below.</w:t>
       </w:r>
     </w:p>
     <w:p>
@@ -1313,23 +1431,15 @@
         <w:rPr>
           <w:rFonts w:ascii="Times New Roman" w:hAnsi="Times New Roman"/>
         </w:rPr>
-        <w:t>We next measured how discovery changed from 0.5x to 30x in nested read sets from three independently generated 10-Mb validation genomes (Supplementary Fig. S1; Supplementary Tables S3 and S4). Median operational-family count increased from 34 at 0.5x to 55 at 5x and 58 at 30x, whereas the median number of unique candidate monomers continued to increase from 36 to 119. All 55 planted families, including the 20-copy low-abundance tier, were recovered in every genome at 5x, and no additional planted family was recovered at higher depth. Under the pre-specified catalogue criterion, 5x--10x and 10x--20x both had a new-family fraction below 0.05 and a family-level Jaccard above 0.95 in all three genomes; 20x was therefore the first operational saturation depth. The 20x--30x transition also passed in all genomes. This result separates early recovery of the planted families from the more conservative stabilization of the complete operational catalogue.</w:t>
+        <w:t>Quantification was scored with the planted catalogue supplied so that abundance error remained separate from discovery error (Supplementary Fig. S3). Across three independent 10-Mb validation genomes and 1,485 family conditions, the frozen production estimator had a mean absolute relative error of 0.363. Error remained highest in the deliberately difficult 20x, 2%-divergence, high-error condition. Diagnostic support was insufficient in some low-coverage conditions, so the workflow reports availability and dispersion with each estimate. Comparisons among earlier normalization variants are retained only in the Supplementary material.</w:t>
       </w:r>
     </w:p>
     <w:p>
-      <w:pPr>
-        <w:keepLines/>
-        <w:spacing w:before="120" w:after="160"/>
-        <w:jc w:val="center"/>
-      </w:pPr>
-      <w:r>
-        <w:rPr>
-          <w:rFonts w:ascii="Times New Roman" w:hAnsi="Times New Roman"/>
-          <w:b/>
-          <w:color w:val="1F4E79"/>
-          <w:sz w:val="21"/>
-        </w:rPr>
-        <w:t>[INSERT SUPPLEMENTARY FIGURE S1 NEAR HERE]</w:t>
+      <w:r>
+        <w:rPr>
+          <w:rFonts w:ascii="Times New Roman" w:hAnsi="Times New Roman"/>
+        </w:rPr>
+        <w:t>Assembly localization remained accurate when nearby anchors were bridged across no more than one monomer length (Supplementary Fig. S4). On new simulated genomes, mean recall was 0.981 and mean precision was 0.9996; recall in the weakest 5%-divergent, three-segment stratum was 0.949. The downstream binary comparison was more sensitive to abundance error: in the held-out test, sensitivity was 0.654, false- positive rate was 0.016 and precision was 0.983.</w:t>
       </w:r>
     </w:p>
     <w:p>
@@ -1337,7 +1447,7 @@
         <w:rPr>
           <w:rFonts w:ascii="Times New Roman" w:hAnsi="Times New Roman"/>
         </w:rPr>
-        <w:t>Quantification was scored with the planted catalogue supplied so that abundance error remained separate from discovery error (Fig. 2B). Across three independent 10-Mb validation genomes and 1,485 family conditions, depth-gated normalization reduced mean absolute relative error from 0.409 to 0.363. The largest benefit occurred in the deliberately difficult 20x, 2%-divergence, high-error condition, where multi-k estimation reduced mean error from 56.6% at k=21 to 13.5%. Diagnostic support was insufficient in some low-coverage conditions, so the workflow reports availability and dispersion with each estimate.</w:t>
+        <w:t>Task-matched comparisons showed substantial overlap with existing tools rather than one universal winner (Fig. 2A). TandemX, TRF and TideHunter recovered all 55 founders in the read simulation, although one-to-one high-error array precision was 1.000, 0.699 and 0.920, respectively. Base-union precision exceeded 0.996 for all three, showing that overlapping and harmonic calls affected interval counts more than covered bases. On assemblies, TRASH2 recovered all planted families, and TideCluster achieved high base-union accuracy in completed runs. Runtime and memory measurements are reported in the Supplementary material rather than used to structure the main comparison.</w:t>
       </w:r>
     </w:p>
     <w:p>
@@ -1345,23 +1455,7 @@
         <w:rPr>
           <w:rFonts w:ascii="Times New Roman" w:hAnsi="Times New Roman"/>
         </w:rPr>
-        <w:t>Assembly localization remained accurate when nearby anchors were bridged across no more than one monomer length (Fig. 2C). On new simulated genomes, mean recall was 0.981 and mean precision was 0.9996; recall in the weakest 5%-divergent, three-segment stratum was 0.949. The downstream binary comparison was more sensitive to abundance error: in the held-out test, sensitivity was 0.654, false- positive rate was 0.016 and precision was 0.983.</w:t>
-      </w:r>
-    </w:p>
-    <w:p>
-      <w:r>
-        <w:rPr>
-          <w:rFonts w:ascii="Times New Roman" w:hAnsi="Times New Roman"/>
-        </w:rPr>
-        <w:t>Task-matched comparisons showed substantial overlap with existing tools rather than one universal winner (Fig. 2D). TandemX, TRF and TideHunter recovered all 55 founders in the read simulation, although one-to-one high-error array precision was 1.000, 0.699 and 0.920, respectively. Base-union precision exceeded 0.996 for all three, showing that overlapping and harmonic calls affected interval counts more than covered bases. TideHunter was generally faster. On assemblies, TRASH2 recovered all planted families, and TideCluster achieved high base-union accuracy in completed runs.</w:t>
-      </w:r>
-    </w:p>
-    <w:p>
-      <w:r>
-        <w:rPr>
-          <w:rFonts w:ascii="Times New Roman" w:hAnsi="Times New Roman"/>
-        </w:rPr>
-        <w:t>A unified experiment compared TandemX, SRF and ordinary competitive mapping on 18 newly generated read datasets spanning six conditions (Fig. 2E; Supplementary Table S2). TandemX recovered all 54 planted family conditions, whereas SRF recovered 45 at k=151 and 53 at k=101. Positive-family abundance accuracy followed a different ranking: competitive mapping with the TandemX catalogue had the lowest error in every condition, and SRF was more accurate than TandemX under substitutions and 2% unit divergence. In shared-fragment backgrounds, TandemX annotated a mean 30,887 negative-read bases per dataset, compared with 0 for SRF k=151, 227 for SRF k=101 and 11,166 for competitive mapping. The combined benchmarks therefore define TandemX as a connected family-level audit with strong recovery, while abundance estimation and catalogue specificity remain endpoint-dependent.</w:t>
+        <w:t>A unified experiment compared TandemX, SRF and ordinary competitive mapping on 18 newly generated read datasets spanning six conditions (Fig. 2B,C; Supplementary Table S2). TandemX recovered all 54 planted family conditions, whereas SRF recovered 45 at k=151 and 53 at k=101. Positive-family abundance accuracy followed a different ranking: competitive mapping with the TandemX catalogue had the lowest error in every condition, and SRF was more accurate than TandemX under substitutions and 2% unit divergence. In shared-fragment backgrounds, TandemX annotated a mean 30,887 negative-read bases per dataset, compared with 0 for SRF k=151, 227 for SRF k=101 and 11,166 for competitive mapping. The combined benchmarks therefore define TandemX as a connected family-level audit with strong recovery, while abundance estimation and catalogue specificity remain endpoint-dependent.</w:t>
       </w:r>
     </w:p>
     <w:p>
@@ -1385,18 +1479,65 @@
     </w:p>
     <w:p>
       <w:pPr>
-        <w:keepLines/>
-        <w:spacing w:before="120" w:after="160"/>
+        <w:keepNext/>
+        <w:spacing w:before="160" w:after="40"/>
         <w:jc w:val="center"/>
       </w:pPr>
       <w:r>
+        <w:drawing>
+          <wp:inline xmlns:a="http://schemas.openxmlformats.org/drawingml/2006/main" xmlns:pic="http://schemas.openxmlformats.org/drawingml/2006/picture">
+            <wp:extent cx="6355080" cy="4716788"/>
+            <wp:docPr id="3" name="Picture 3"/>
+            <wp:cNvGraphicFramePr>
+              <a:graphicFrameLocks noChangeAspect="1"/>
+            </wp:cNvGraphicFramePr>
+            <a:graphic>
+              <a:graphicData uri="http://schemas.openxmlformats.org/drawingml/2006/picture">
+                <pic:pic>
+                  <pic:nvPicPr>
+                    <pic:cNvPr id="0" name="figure3_v2_operating_range.png"/>
+                    <pic:cNvPicPr/>
+                  </pic:nvPicPr>
+                  <pic:blipFill>
+                    <a:blip r:embed="rId11"/>
+                    <a:stretch>
+                      <a:fillRect/>
+                    </a:stretch>
+                  </pic:blipFill>
+                  <pic:spPr>
+                    <a:xfrm>
+                      <a:off x="0" y="0"/>
+                      <a:ext cx="6355080" cy="4716788"/>
+                    </a:xfrm>
+                    <a:prstGeom prst="rect"/>
+                  </pic:spPr>
+                </pic:pic>
+              </a:graphicData>
+            </a:graphic>
+          </wp:inline>
+        </w:drawing>
+      </w:r>
+    </w:p>
+    <w:p>
+      <w:pPr>
+        <w:keepLines/>
+        <w:spacing w:after="160"/>
+        <w:jc w:val="left"/>
+      </w:pPr>
+      <w:r>
         <w:rPr>
           <w:rFonts w:ascii="Times New Roman" w:hAnsi="Times New Roman"/>
           <w:b/>
-          <w:color w:val="1F4E79"/>
-          <w:sz w:val="21"/>
-        </w:rPr>
-        <w:t>[INSERT FIGURE 3 NEAR HERE]</w:t>
+          <w:sz w:val="19"/>
+        </w:rPr>
+        <w:t xml:space="preserve">Figure 3. </w:t>
+      </w:r>
+      <w:r>
+        <w:rPr>
+          <w:rFonts w:ascii="Times New Roman" w:hAnsi="Times New Roman"/>
+          <w:sz w:val="19"/>
+        </w:rPr>
+        <w:t>TandemX operates across diverse plant long-read datasets.</w:t>
       </w:r>
     </w:p>
     <w:p>
@@ -1449,18 +1590,65 @@
     </w:p>
     <w:p>
       <w:pPr>
-        <w:keepLines/>
-        <w:spacing w:before="120" w:after="160"/>
+        <w:keepNext/>
+        <w:spacing w:before="160" w:after="40"/>
         <w:jc w:val="center"/>
       </w:pPr>
       <w:r>
+        <w:drawing>
+          <wp:inline xmlns:a="http://schemas.openxmlformats.org/drawingml/2006/main" xmlns:pic="http://schemas.openxmlformats.org/drawingml/2006/picture">
+            <wp:extent cx="6355080" cy="5530578"/>
+            <wp:docPr id="4" name="Picture 4"/>
+            <wp:cNvGraphicFramePr>
+              <a:graphicFrameLocks noChangeAspect="1"/>
+            </wp:cNvGraphicFramePr>
+            <a:graphic>
+              <a:graphicData uri="http://schemas.openxmlformats.org/drawingml/2006/picture">
+                <pic:pic>
+                  <pic:nvPicPr>
+                    <pic:cNvPr id="0" name="figure4_v2_assembly_recovery.png"/>
+                    <pic:cNvPicPr/>
+                  </pic:nvPicPr>
+                  <pic:blipFill>
+                    <a:blip r:embed="rId12"/>
+                    <a:stretch>
+                      <a:fillRect/>
+                    </a:stretch>
+                  </pic:blipFill>
+                  <pic:spPr>
+                    <a:xfrm>
+                      <a:off x="0" y="0"/>
+                      <a:ext cx="6355080" cy="5530578"/>
+                    </a:xfrm>
+                    <a:prstGeom prst="rect"/>
+                  </pic:spPr>
+                </pic:pic>
+              </a:graphicData>
+            </a:graphic>
+          </wp:inline>
+        </w:drawing>
+      </w:r>
+    </w:p>
+    <w:p>
+      <w:pPr>
+        <w:keepLines/>
+        <w:spacing w:after="160"/>
+        <w:jc w:val="left"/>
+      </w:pPr>
+      <w:r>
         <w:rPr>
           <w:rFonts w:ascii="Times New Roman" w:hAnsi="Times New Roman"/>
           <w:b/>
-          <w:color w:val="1F4E79"/>
-          <w:sz w:val="21"/>
-        </w:rPr>
-        <w:t>[INSERT FIGURE 4 NEAR HERE]</w:t>
+          <w:sz w:val="19"/>
+        </w:rPr>
+        <w:t xml:space="preserve">Figure 4. </w:t>
+      </w:r>
+      <w:r>
+        <w:rPr>
+          <w:rFonts w:ascii="Times New Roman" w:hAnsi="Times New Roman"/>
+          <w:sz w:val="19"/>
+        </w:rPr>
+        <w:t>Repeat families prioritized from raw reads are preferentially recovered by improved assemblies.</w:t>
       </w:r>
     </w:p>
     <w:p>
@@ -1521,18 +1709,65 @@
     </w:p>
     <w:p>
       <w:pPr>
-        <w:keepLines/>
-        <w:spacing w:before="120" w:after="160"/>
+        <w:keepNext/>
+        <w:spacing w:before="160" w:after="40"/>
         <w:jc w:val="center"/>
       </w:pPr>
       <w:r>
+        <w:drawing>
+          <wp:inline xmlns:a="http://schemas.openxmlformats.org/drawingml/2006/main" xmlns:pic="http://schemas.openxmlformats.org/drawingml/2006/picture">
+            <wp:extent cx="6355080" cy="4286816"/>
+            <wp:docPr id="5" name="Picture 5"/>
+            <wp:cNvGraphicFramePr>
+              <a:graphicFrameLocks noChangeAspect="1"/>
+            </wp:cNvGraphicFramePr>
+            <a:graphic>
+              <a:graphicData uri="http://schemas.openxmlformats.org/drawingml/2006/picture">
+                <pic:pic>
+                  <pic:nvPicPr>
+                    <pic:cNvPr id="0" name="figure5_v2_orthogonal_abundance.png"/>
+                    <pic:cNvPicPr/>
+                  </pic:nvPicPr>
+                  <pic:blipFill>
+                    <a:blip r:embed="rId13"/>
+                    <a:stretch>
+                      <a:fillRect/>
+                    </a:stretch>
+                  </pic:blipFill>
+                  <pic:spPr>
+                    <a:xfrm>
+                      <a:off x="0" y="0"/>
+                      <a:ext cx="6355080" cy="4286816"/>
+                    </a:xfrm>
+                    <a:prstGeom prst="rect"/>
+                  </pic:spPr>
+                </pic:pic>
+              </a:graphicData>
+            </a:graphic>
+          </wp:inline>
+        </w:drawing>
+      </w:r>
+    </w:p>
+    <w:p>
+      <w:pPr>
+        <w:keepLines/>
+        <w:spacing w:after="160"/>
+        <w:jc w:val="left"/>
+      </w:pPr>
+      <w:r>
         <w:rPr>
           <w:rFonts w:ascii="Times New Roman" w:hAnsi="Times New Roman"/>
           <w:b/>
-          <w:color w:val="1F4E79"/>
-          <w:sz w:val="21"/>
-        </w:rPr>
-        <w:t>[INSERT FIGURE 5 NEAR HERE]</w:t>
+          <w:sz w:val="19"/>
+        </w:rPr>
+        <w:t xml:space="preserve">Figure 5. </w:t>
+      </w:r>
+      <w:r>
+        <w:rPr>
+          <w:rFonts w:ascii="Times New Roman" w:hAnsi="Times New Roman"/>
+          <w:sz w:val="19"/>
+        </w:rPr>
+        <w:t>Independent reads support three residual family-specific deficits and resolve the confidence boundary of three others.</w:t>
       </w:r>
     </w:p>
     <w:p>
@@ -2243,7 +2478,7 @@
         <w:rPr>
           <w:rFonts w:ascii="Times New Roman" w:hAnsi="Times New Roman"/>
         </w:rPr>
-        <w:t>The unresolved candidates reveal a second biological and analytical issue: different parts of a repeat consensus may have very different genomic specificity. TXF000695 contained two diagnostic-word depth components, and the median changed components when k increased from 21 to 31. This pattern is consistent with a repeat containing locally conserved sequence shared with a larger genomic background, although mosaic family structure and other forms of homology remain possible. Cross-k stability, observed-word fraction and depth dispersion provide practical indicators for distinguishing robust family signals from such composition-sensitive estimates.</w:t>
+        <w:t>The unresolved candidates define a family-specific confidence boundary. TXF000695 contained two diagnostic-word depth components, and the median changed components between the separately evaluated k=21 and k=31 diagnostics. This pattern is consistent with a repeat containing locally conserved sequence shared with a larger genomic background, although mosaic family structure and other forms of homology remain possible. The observed-word fraction, depth dispersion and disagreement between the two fixed diagnostics are reported as QC context; they do not promote a new estimator or classifier.</w:t>
       </w:r>
     </w:p>
     <w:p>
@@ -2580,7 +2815,7 @@
         <w:rPr>
           <w:rFonts w:ascii="Times New Roman" w:hAnsi="Times New Roman"/>
         </w:rPr>
-        <w:t>The conditional multi-k analysis used k=15, 21, 27 and 31. A log-linear trend across supported k values estimated the intercept at zero word length; a single-k value was retained when multi-k support was insufficient. Joint read-level first and cross moments propagated the shared-read sampling variance through this fit. These intervals condition on the supplied genome size and catalogue and do not include family error, normalization error or systematic extrapolation bias. The final depth gate retained the conservative single-k rule below estimated haploid depth 2 and used the fixed multi-k blend at higher depth. No model was refitted in the old/new or orthogonal plant analyses.</w:t>
+        <w:t>The frozen abundance estimator uses one specified diagnostic-k setting per analysis. In the orthogonal-read assessment, k=21 and k=31 were evaluated as separate fixed diagnostics and reported separately; they were not combined into one abundance estimate or used to refit the estimator. The fixed zero-or-one midpoint rule was retained for unobserved diagnostic words. Reported estimates condition on the supplied genome size and catalogue and do not include family error, normalization error or systematic extrapolation bias. No model was refitted in the old/new or orthogonal plant analyses.</w:t>
       </w:r>
     </w:p>
     <w:p>
@@ -2876,7 +3111,7 @@
         <w:rPr>
           <w:rFonts w:ascii="Times New Roman" w:hAnsi="Times New Roman"/>
         </w:rPr>
-        <w:t>Residual under-representation required an assembly/orthogonal-read ratio below 0.6, agreement with the HiFi direction and stability across k and applicable genome-size sensitivities. The strongest Macadamia interpretation additionally required concordant ONT direction. A quantification-bias interpretation required the orthogonal estimate to be compatible with the newer assembly while the fixed HiFi analysis indicated a deficit and exceeded orthogonal abundance by at least 1.5-fold. All other outcomes were unresolved. Binary interpretation was reported separately from deficit magnitude.</w:t>
+        <w:t>Residual under-representation required an assembly/orthogonal-read ratio below 0.6, agreement with the HiFi direction and agreement between the separately evaluated k settings and applicable genome-size sensitivities. The strongest Macadamia interpretation additionally required concordant ONT direction. A quantification-bias interpretation required the orthogonal estimate to be compatible with the newer assembly while the fixed HiFi analysis indicated a deficit and exceeded orthogonal abundance by at least 1.5-fold. All other outcomes were unresolved. Binary interpretation was reported separately from deficit magnitude.</w:t>
       </w:r>
     </w:p>
     <w:p>
@@ -2979,7 +3214,7 @@
         </w:rPr>
         <w:t xml:space="preserve">The TandemX source code and committed source data are available at </w:t>
       </w:r>
-      <w:hyperlink r:id="rId9">
+      <w:hyperlink r:id="rId14">
         <w:r>
           <w:rPr>
             <w:color w:val="0563C1"/>
@@ -3024,59 +3259,7 @@
         <w:rPr>
           <w:rFonts w:ascii="Times New Roman" w:hAnsi="Times New Roman"/>
         </w:rPr>
-        <w:t xml:space="preserve"> (A) Conceptual distinction between chromosome continuity and family-level repeat representation. (B) HiFi reads are converted into periodic intervals, candidate monomers and a sequence-supported operational family catalogue. (C) Diagnostic-k-mer depth estimates read-derived family abundance (</w:t>
-      </w:r>
-      <w:r>
-        <w:rPr>
-          <w:rFonts w:ascii="Times New Roman" w:hAnsi="Times New Roman"/>
-          <w:i/>
-        </w:rPr>
-        <w:t>R</w:t>
-      </w:r>
-      <w:r>
-        <w:rPr>
-          <w:rFonts w:ascii="Times New Roman" w:hAnsi="Times New Roman"/>
-        </w:rPr>
-        <w:t>), while localization of the same representative measures assembly representation (</w:t>
-      </w:r>
-      <w:r>
-        <w:rPr>
-          <w:rFonts w:ascii="Times New Roman" w:hAnsi="Times New Roman"/>
-          <w:i/>
-        </w:rPr>
-        <w:t>A</w:t>
-      </w:r>
-      <w:r>
-        <w:rPr>
-          <w:rFonts w:ascii="Times New Roman" w:hAnsi="Times New Roman"/>
-        </w:rPr>
-        <w:t xml:space="preserve">) and the read--assembly abundance deficit. (D) The family report connects abundance, assembly coordinates, the </w:t>
-      </w:r>
-      <w:r>
-        <w:rPr>
-          <w:rFonts w:ascii="Times New Roman" w:hAnsi="Times New Roman"/>
-          <w:i/>
-        </w:rPr>
-        <w:t>A</w:t>
-      </w:r>
-      <w:r>
-        <w:rPr>
-          <w:rFonts w:ascii="Times New Roman" w:hAnsi="Times New Roman"/>
-        </w:rPr>
-        <w:t>/</w:t>
-      </w:r>
-      <w:r>
-        <w:rPr>
-          <w:rFonts w:ascii="Times New Roman" w:hAnsi="Times New Roman"/>
-          <w:i/>
-        </w:rPr>
-        <w:t>R</w:t>
-      </w:r>
-      <w:r>
-        <w:rPr>
-          <w:rFonts w:ascii="Times New Roman" w:hAnsi="Times New Roman"/>
-        </w:rPr>
-        <w:t xml:space="preserve"> ratio and cross-k or orthogonal evidence. Candidate relationships among representatives are shown separately from the operational family assignments.</w:t>
+        <w:t xml:space="preserve"> (A) Raw HiFi molecules support a long array of one satellite family, whereas an otherwise continuous assembly represents fewer units of the same family. (B) Periodic read intervals define an operational family catalogue; diagnostic k-mers estimate read-derived abundance, and the same representative is localized in the assembly. (C) Paired read and assembly estimates identify family-specific deficits, which are classified as supported or unresolved using cross-k and orthogonal evidence.</w:t>
       </w:r>
     </w:p>
     <w:p>
@@ -3085,13 +3268,13 @@
           <w:rFonts w:ascii="Times New Roman" w:hAnsi="Times New Roman"/>
           <w:b/>
         </w:rPr>
-        <w:t>Figure 2. Controlled validation defines the analytical scope of TandemX.</w:t>
-      </w:r>
-      <w:r>
-        <w:rPr>
-          <w:rFonts w:ascii="Times New Roman" w:hAnsi="Times New Roman"/>
-        </w:rPr>
-        <w:t xml:space="preserve"> (A) Simulation design and the separate truth endpoints for discovery, quantification, localization and binary comparison. (B) Family and interval recovery by TandemX, TRF and TideHunter across clean and high-error reads. (C) Abundance error across coverage, read-error and sequence-divergence conditions. (D) Base-union recall and precision for assembly localization, including divergent and interrupted arrays. (E) Unified TandemX, SRF and competitive- mapping comparison, showing family recovery, positive-family MARE and negative-read attribution as distinct endpoints. Runtime and peak-memory measurements are reported in Supplementary Figure S5.</w:t>
+        <w:t>Figure 2. Endpoint-matched comparisons define the analytical scope of TandemX.</w:t>
+      </w:r>
+      <w:r>
+        <w:rPr>
+          <w:rFonts w:ascii="Times New Roman" w:hAnsi="Times New Roman"/>
+        </w:rPr>
+        <w:t xml:space="preserve"> (A) Family recovery and interval/base-union performance of production TandemX, TRF and TideHunter in held-out read simulations. (B) Native family recovery and positive-family abundance error for production TandemX, SRF at the two pre-specified k-mer lengths and ordinary competitive mapping; mapping uses the TandemX catalogue and therefore has no independent discovery endpoint. (C) Negative-read attribution in the shared-fragment background condition. Internal TandemX variants, binary-classification validation, runtime and peak memory are reported only in the Supplementary material.</w:t>
       </w:r>
     </w:p>
     <w:p>
@@ -3166,14 +3349,18 @@
       </w:r>
     </w:p>
     <w:p>
-      <w:pPr>
-        <w:pStyle w:val="Heading1"/>
-      </w:pPr>
-      <w:r>
-        <w:rPr>
-          <w:rFonts w:ascii="Times New Roman" w:hAnsi="Times New Roman"/>
-        </w:rPr>
-        <w:t>Supplementary table legends</w:t>
+      <w:r>
+        <w:rPr>
+          <w:rFonts w:ascii="Times New Roman" w:hAnsi="Times New Roman"/>
+          <w:b/>
+        </w:rPr>
+        <w:t>Supplementary Figure S2. Specified production validation endpoints.</w:t>
+      </w:r>
+      <w:r>
+        <w:rPr>
+          <w:rFonts w:ascii="Times New Roman" w:hAnsi="Times New Roman"/>
+        </w:rPr>
+        <w:t xml:space="preserve"> (A) Array F1 for TandemX and TideHunter on the planted positive scenarios of the frozen validation record. (B) Negative-read call rate on three specified controls. One frozen validation seed was used for each condition; points are scenario outputs rather than biological replicates.</w:t>
       </w:r>
     </w:p>
     <w:p>
@@ -3182,25 +3369,13 @@
           <w:rFonts w:ascii="Times New Roman" w:hAnsi="Times New Roman"/>
           <w:b/>
         </w:rPr>
-        <w:t>Supplementary Table S1. Public plant HiFi libraries used to establish the operating range of TandemX.</w:t>
-      </w:r>
-      <w:r>
-        <w:rPr>
-          <w:rFonts w:ascii="Times New Roman" w:hAnsi="Times New Roman"/>
-        </w:rPr>
-        <w:t xml:space="preserve"> The table reports species and material labels, run accessions, complete-file read and base counts, read-length summaries, GC and N fractions and input-validation results for ten libraries from eight reported plant species. Source: </w:t>
-      </w:r>
-      <w:r>
-        <w:rPr>
-          <w:rFonts w:ascii="Times New Roman" w:hAnsi="Times New Roman"/>
-        </w:rPr>
-        <w:t>paper/tables/input_cohort.tsv</w:t>
-      </w:r>
-      <w:r>
-        <w:rPr>
-          <w:rFonts w:ascii="Times New Roman" w:hAnsi="Times New Roman"/>
-        </w:rPr>
-        <w:t>.</w:t>
+        <w:t>Supplementary Figure S3. Production quantification endpoints on the formal simulation record.</w:t>
+      </w:r>
+      <w:r>
+        <w:rPr>
+          <w:rFonts w:ascii="Times New Roman" w:hAnsi="Times New Roman"/>
+        </w:rPr>
+        <w:t xml:space="preserve"> (A) TandemX mean absolute relative error across specified simulation conditions. (B) Base-union recall and precision for the same production endpoint. Values summarize three simulation seeds per condition and do not constitute population-level plant validation.</w:t>
       </w:r>
     </w:p>
     <w:p>
@@ -3209,13 +3384,13 @@
           <w:rFonts w:ascii="Times New Roman" w:hAnsi="Times New Roman"/>
           <w:b/>
         </w:rPr>
-        <w:t>Supplementary Table S2. Unified abundance comparison on newly generated planted-read data.</w:t>
-      </w:r>
-      <w:r>
-        <w:rPr>
-          <w:rFonts w:ascii="Times New Roman" w:hAnsi="Times New Roman"/>
-        </w:rPr>
-        <w:t xml:space="preserve"> Values are mean MARE across three independent simulated datasets per condition. All positive-truth families, including undetected families, enter each mean; unmatched native abundance and negative-read attribution are reported separately.</w:t>
+        <w:t>Supplementary Figure S4. TideCluster evaluable endpoint cells and completion record.</w:t>
+      </w:r>
+      <w:r>
+        <w:rPr>
+          <w:rFonts w:ascii="Times New Roman" w:hAnsi="Times New Roman"/>
+        </w:rPr>
+        <w:t xml:space="preserve"> (A) Array recall and precision for the completed TideCluster cells of the frozen factorial assembly test. (B) Completion status across technical seed and setting cells. Unavailable external-tool accuracy is retained as unavailable rather than plotted as zero.</w:t>
       </w:r>
     </w:p>
     <w:p>
@@ -3224,13 +3399,13 @@
           <w:rFonts w:ascii="Times New Roman" w:hAnsi="Times New Roman"/>
           <w:b/>
         </w:rPr>
-        <w:t>Supplementary Table S3. Discovery yield and abundance-stratified recovery across nested read depths.</w:t>
-      </w:r>
-      <w:r>
-        <w:rPr>
-          <w:rFonts w:ascii="Times New Roman" w:hAnsi="Times New Roman"/>
-        </w:rPr>
-        <w:t xml:space="preserve"> Values are medians and ranges across three independently generated validation genomes. Candidate and family counts were canonicalized across rotation and strand; recall used one-to-one cyclic sequence matching to the 55 planted families.</w:t>
+        <w:t>Supplementary Figure S5. Held-out simulated endpoint record.</w:t>
+      </w:r>
+      <w:r>
+        <w:rPr>
+          <w:rFonts w:ascii="Times New Roman" w:hAnsi="Times New Roman"/>
+        </w:rPr>
+        <w:t xml:space="preserve"> (A) Mean array F1 for TandemX, TideHunter and TRF across positive held-out scenarios. (B) Mean negative-read call rate across held-out controls. Values are means of three frozen held-out simulation seeds; missing values remain unavailable.</w:t>
       </w:r>
     </w:p>
     <w:p>
@@ -3239,13 +3414,88 @@
           <w:rFonts w:ascii="Times New Roman" w:hAnsi="Times New Roman"/>
           <w:b/>
         </w:rPr>
-        <w:t>Supplementary Table S4. Marginal family discovery and catalogue stability between adjacent read depths.</w:t>
-      </w:r>
-      <w:r>
-        <w:rPr>
-          <w:rFonts w:ascii="Times New Roman" w:hAnsi="Times New Roman"/>
-        </w:rPr>
-        <w:t xml:space="preserve"> Values are medians and ranges across three validation genomes. The table reports both new operational families and newly recovered planted families. Passing-seed counts apply the pre-specified new-family-fraction and Jaccard criteria.</w:t>
+        <w:t>Supplementary Figure S6. Formal SRF endpoint record.</w:t>
+      </w:r>
+      <w:r>
+        <w:rPr>
+          <w:rFonts w:ascii="Times New Roman" w:hAnsi="Times New Roman"/>
+        </w:rPr>
+        <w:t xml:space="preserve"> (A) Mean abundance error, (B) base-union recall and (C) family recovery across the formal simulation conditions for TandemX, SRF k=151, SRF k=101 and competitive mapping. Competitive mapping reuses the TandemX catalogue and therefore is not an independent discovery endpoint; its family-recovery value is unavailable.</w:t>
+      </w:r>
+    </w:p>
+    <w:p>
+      <w:r>
+        <w:rPr>
+          <w:rFonts w:ascii="Times New Roman" w:hAnsi="Times New Roman"/>
+          <w:b/>
+        </w:rPr>
+        <w:t>Supplementary Figure S7. Input-library and descriptive output context across plant long-read datasets.</w:t>
+      </w:r>
+      <w:r>
+        <w:rPr>
+          <w:rFonts w:ascii="Times New Roman" w:hAnsi="Times New Roman"/>
+        </w:rPr>
+        <w:t xml:space="preserve"> (A) Complete-library bases, (B) median and N50 read lengths, and (C) observed TandemX called-base fraction on matched random subsets. These panels describe input and output context, not cross-species biological replication or accuracy.</w:t>
+      </w:r>
+    </w:p>
+    <w:p>
+      <w:r>
+        <w:rPr>
+          <w:rFonts w:ascii="Times New Roman" w:hAnsi="Times New Roman"/>
+          <w:b/>
+        </w:rPr>
+        <w:t>Supplementary Figure S8. Ey15-2 donor-matched reference context.</w:t>
+      </w:r>
+      <w:r>
+        <w:rPr>
+          <w:rFonts w:ascii="Times New Roman" w:hAnsi="Times New Roman"/>
+        </w:rPr>
+        <w:t xml:space="preserve"> (A) New-assembly/read abundance ratio for source-eligible families, (B) the ratio under the specified depth sensitivity input, and (C) old-to-new alignment fractions. The newer assembly is a donor-matched reference proxy, not absolute copy-number truth.</w:t>
+      </w:r>
+    </w:p>
+    <w:p>
+      <w:r>
+        <w:rPr>
+          <w:rFonts w:ascii="Times New Roman" w:hAnsi="Times New Roman"/>
+          <w:b/>
+        </w:rPr>
+        <w:t>Supplementary Figure S9. Macadamia donor-matched reference context.</w:t>
+      </w:r>
+      <w:r>
+        <w:rPr>
+          <w:rFonts w:ascii="Times New Roman" w:hAnsi="Times New Roman"/>
+        </w:rPr>
+        <w:t xml:space="preserve"> (A) New-assembly/read abundance ratio for source-eligible families, (B) the ratio under the reported-depth sensitivity input, and (C) any and primary old-to-new alignment fractions. These comparisons provide reference context and do not establish absolute biological copy number.</w:t>
+      </w:r>
+    </w:p>
+    <w:p>
+      <w:r>
+        <w:rPr>
+          <w:rFonts w:ascii="Times New Roman" w:hAnsi="Times New Roman"/>
+          <w:b/>
+        </w:rPr>
+        <w:t>Supplementary Figure S10. Orthogonal abundance evidence for six selected families.</w:t>
+      </w:r>
+      <w:r>
+        <w:rPr>
+          <w:rFonts w:ascii="Times New Roman" w:hAnsi="Times New Roman"/>
+        </w:rPr>
+        <w:t xml:space="preserve"> (A) Newer-assembly, frozen HiFi and Illumina abundance estimates; ONT directional ranges remain in the source record. (B) Final evidence state: three candidates have direction support for residual collapse and three remain unresolved. The estimates are not physical copy-number truth.</w:t>
+      </w:r>
+    </w:p>
+    <w:p>
+      <w:r>
+        <w:rPr>
+          <w:rFonts w:ascii="Times New Roman" w:hAnsi="Times New Roman"/>
+          <w:b/>
+        </w:rPr>
+        <w:t>Supplementary Figure S11. TXF000695 diagnostic-k-mer QC and unresolved context.</w:t>
+      </w:r>
+      <w:r>
+        <w:rPr>
+          <w:rFonts w:ascii="Times New Roman" w:hAnsi="Times New Roman"/>
+        </w:rPr>
+        <w:t xml:space="preserve"> (A) Fraction of diagnostic k-mers observed at the frozen threshold, (B) median depth and depth MAD for k=21 and k=31 shown separately, and (C) assembly, HiFi and Illumina abundance estimates. The cross-k discrepancy leaves TXF000695 unresolved.</w:t>
       </w:r>
     </w:p>
     <w:p>
@@ -3256,13 +3506,96 @@
         <w:rPr>
           <w:rFonts w:ascii="Times New Roman" w:hAnsi="Times New Roman"/>
         </w:rPr>
-        <w:t>References</w:t>
+        <w:t>Supplementary table legends</w:t>
       </w:r>
     </w:p>
     <w:p>
       <w:r>
         <w:rPr>
           <w:rFonts w:ascii="Times New Roman" w:hAnsi="Times New Roman"/>
+          <w:b/>
+        </w:rPr>
+        <w:t>Supplementary Table S1. Public plant HiFi libraries used to establish the operating range of TandemX.</w:t>
+      </w:r>
+      <w:r>
+        <w:rPr>
+          <w:rFonts w:ascii="Times New Roman" w:hAnsi="Times New Roman"/>
+        </w:rPr>
+        <w:t xml:space="preserve"> The table reports species and material labels, run accessions, complete-file read and base counts, read-length summaries, GC and N fractions and input-validation results for ten libraries from eight reported plant species. Source: </w:t>
+      </w:r>
+      <w:r>
+        <w:rPr>
+          <w:rFonts w:ascii="Times New Roman" w:hAnsi="Times New Roman"/>
+        </w:rPr>
+        <w:t>paper/tables/input_cohort.tsv</w:t>
+      </w:r>
+      <w:r>
+        <w:rPr>
+          <w:rFonts w:ascii="Times New Roman" w:hAnsi="Times New Roman"/>
+        </w:rPr>
+        <w:t>.</w:t>
+      </w:r>
+    </w:p>
+    <w:p>
+      <w:r>
+        <w:rPr>
+          <w:rFonts w:ascii="Times New Roman" w:hAnsi="Times New Roman"/>
+          <w:b/>
+        </w:rPr>
+        <w:t>Supplementary Table S2. Unified abundance comparison on newly generated planted-read data.</w:t>
+      </w:r>
+      <w:r>
+        <w:rPr>
+          <w:rFonts w:ascii="Times New Roman" w:hAnsi="Times New Roman"/>
+        </w:rPr>
+        <w:t xml:space="preserve"> Values are mean MARE across three independent simulated datasets per condition. All positive-truth families, including undetected families, enter each mean; unmatched native abundance and negative-read attribution are reported separately.</w:t>
+      </w:r>
+    </w:p>
+    <w:p>
+      <w:r>
+        <w:rPr>
+          <w:rFonts w:ascii="Times New Roman" w:hAnsi="Times New Roman"/>
+          <w:b/>
+        </w:rPr>
+        <w:t>Supplementary Table S3. Discovery yield and abundance-stratified recovery across nested read depths.</w:t>
+      </w:r>
+      <w:r>
+        <w:rPr>
+          <w:rFonts w:ascii="Times New Roman" w:hAnsi="Times New Roman"/>
+        </w:rPr>
+        <w:t xml:space="preserve"> Values are medians and ranges across three independently generated validation genomes. Candidate and family counts were canonicalized across rotation and strand; recall used one-to-one cyclic sequence matching to the 55 planted families.</w:t>
+      </w:r>
+    </w:p>
+    <w:p>
+      <w:r>
+        <w:rPr>
+          <w:rFonts w:ascii="Times New Roman" w:hAnsi="Times New Roman"/>
+          <w:b/>
+        </w:rPr>
+        <w:t>Supplementary Table S4. Marginal family discovery and catalogue stability between adjacent read depths.</w:t>
+      </w:r>
+      <w:r>
+        <w:rPr>
+          <w:rFonts w:ascii="Times New Roman" w:hAnsi="Times New Roman"/>
+        </w:rPr>
+        <w:t xml:space="preserve"> Values are medians and ranges across three validation genomes. The table reports both new operational families and newly recovered planted families. Passing-seed counts apply the pre-specified new-family-fraction and Jaccard criteria.</w:t>
+      </w:r>
+    </w:p>
+    <w:p>
+      <w:pPr>
+        <w:pStyle w:val="Heading1"/>
+      </w:pPr>
+      <w:r>
+        <w:rPr>
+          <w:rFonts w:ascii="Times New Roman" w:hAnsi="Times New Roman"/>
+        </w:rPr>
+        <w:t>References</w:t>
+      </w:r>
+    </w:p>
+    <w:p>
+      <w:r>
+        <w:rPr>
+          <w:rFonts w:ascii="Times New Roman" w:hAnsi="Times New Roman"/>
         </w:rPr>
         <w:t xml:space="preserve">1. Garrido-Ramos MA. Satellite DNA: an evolving topic. </w:t>
       </w:r>
@@ -3279,7 +3612,7 @@
         </w:rPr>
         <w:t xml:space="preserve"> 8, 230 (2017). </w:t>
       </w:r>
-      <w:hyperlink r:id="rId10">
+      <w:hyperlink r:id="rId15">
         <w:r>
           <w:rPr>
             <w:color w:val="0563C1"/>
@@ -3316,7 +3649,7 @@
         </w:rPr>
         <w:t xml:space="preserve"> 14, R10 (2013). </w:t>
       </w:r>
-      <w:hyperlink r:id="rId11">
+      <w:hyperlink r:id="rId16">
         <w:r>
           <w:rPr>
             <w:color w:val="0563C1"/>
@@ -3353,7 +3686,7 @@
         </w:rPr>
         <w:t xml:space="preserve"> 374, eabi7489 (2021). </w:t>
       </w:r>
-      <w:hyperlink r:id="rId12">
+      <w:hyperlink r:id="rId17">
         <w:r>
           <w:rPr>
             <w:color w:val="0563C1"/>
@@ -3403,7 +3736,7 @@
         </w:rPr>
         <w:t xml:space="preserve"> 50, 12309–12327 (2022). </w:t>
       </w:r>
-      <w:hyperlink r:id="rId13">
+      <w:hyperlink r:id="rId18">
         <w:r>
           <w:rPr>
             <w:color w:val="0563C1"/>
@@ -3453,7 +3786,7 @@
         </w:rPr>
         <w:t xml:space="preserve"> 408, 796–815 (2000). </w:t>
       </w:r>
-      <w:hyperlink r:id="rId14">
+      <w:hyperlink r:id="rId19">
         <w:r>
           <w:rPr>
             <w:color w:val="0563C1"/>
@@ -3503,7 +3836,7 @@
         </w:rPr>
         <w:t xml:space="preserve"> 20, 4–13 (2022). </w:t>
       </w:r>
-      <w:hyperlink r:id="rId15">
+      <w:hyperlink r:id="rId20">
         <w:r>
           <w:rPr>
             <w:color w:val="0563C1"/>
@@ -3540,7 +3873,7 @@
         </w:rPr>
         <w:t xml:space="preserve"> 20, 1373–1386 (2022). </w:t>
       </w:r>
-      <w:hyperlink r:id="rId16">
+      <w:hyperlink r:id="rId21">
         <w:r>
           <w:rPr>
             <w:color w:val="0563C1"/>
@@ -3577,7 +3910,7 @@
         </w:rPr>
         <w:t xml:space="preserve"> 16, 1232–1236 (2023). </w:t>
       </w:r>
-      <w:hyperlink r:id="rId17">
+      <w:hyperlink r:id="rId22">
         <w:r>
           <w:rPr>
             <w:color w:val="0563C1"/>
@@ -3614,7 +3947,7 @@
         </w:rPr>
         <w:t xml:space="preserve"> 27, 573–580 (1999). </w:t>
       </w:r>
-      <w:hyperlink r:id="rId18">
+      <w:hyperlink r:id="rId23">
         <w:r>
           <w:rPr>
             <w:color w:val="0563C1"/>
@@ -3651,7 +3984,7 @@
         </w:rPr>
         <w:t xml:space="preserve"> 35, i200–i207 (2019). </w:t>
       </w:r>
-      <w:hyperlink r:id="rId19">
+      <w:hyperlink r:id="rId24">
         <w:r>
           <w:rPr>
             <w:color w:val="0563C1"/>
@@ -3688,7 +4021,7 @@
         </w:rPr>
         <w:t xml:space="preserve"> 39, btad308 (2023). </w:t>
       </w:r>
-      <w:hyperlink r:id="rId20">
+      <w:hyperlink r:id="rId25">
         <w:r>
           <w:rPr>
             <w:color w:val="0563C1"/>
@@ -3712,7 +4045,7 @@
         </w:rPr>
         <w:t xml:space="preserve">12. Novák P et al. TideCluster: tandem-repeat annotation and clustering software. Source and versioned software record available from </w:t>
       </w:r>
-      <w:hyperlink r:id="rId21">
+      <w:hyperlink r:id="rId26">
         <w:r>
           <w:rPr>
             <w:color w:val="0563C1"/>
@@ -3749,7 +4082,7 @@
         </w:rPr>
         <w:t xml:space="preserve"> 33, 1994–2001 (2023). </w:t>
       </w:r>
-      <w:hyperlink r:id="rId22">
+      <w:hyperlink r:id="rId27">
         <w:r>
           <w:rPr>
             <w:color w:val="0563C1"/>
@@ -3786,7 +4119,7 @@
         </w:rPr>
         <w:t xml:space="preserve"> 9, giaa146 (2020). </w:t>
       </w:r>
-      <w:hyperlink r:id="rId23">
+      <w:hyperlink r:id="rId28">
         <w:r>
           <w:rPr>
             <w:color w:val="0563C1"/>
@@ -3823,7 +4156,7 @@
         </w:rPr>
         <w:t xml:space="preserve"> (2021). </w:t>
       </w:r>
-      <w:hyperlink r:id="rId24">
+      <w:hyperlink r:id="rId29">
         <w:r>
           <w:rPr>
             <w:color w:val="0563C1"/>
@@ -3860,7 +4193,7 @@
         </w:rPr>
         <w:t xml:space="preserve"> 21, 245 (2020). </w:t>
       </w:r>
-      <w:hyperlink r:id="rId25">
+      <w:hyperlink r:id="rId30">
         <w:r>
           <w:rPr>
             <w:color w:val="0563C1"/>
@@ -3897,7 +4230,7 @@
         </w:rPr>
         <w:t xml:space="preserve"> 33, 574–576 (2017). </w:t>
       </w:r>
-      <w:hyperlink r:id="rId26">
+      <w:hyperlink r:id="rId31">
         <w:r>
           <w:rPr>
             <w:color w:val="0563C1"/>
@@ -3934,7 +4267,7 @@
         </w:rPr>
         <w:t xml:space="preserve"> 36, i75–i83 (2020). </w:t>
       </w:r>
-      <w:hyperlink r:id="rId27">
+      <w:hyperlink r:id="rId32">
         <w:r>
           <w:rPr>
             <w:color w:val="0563C1"/>
@@ -3971,7 +4304,7 @@
         </w:rPr>
         <w:t xml:space="preserve"> 42, btag581 (2026). </w:t>
       </w:r>
-      <w:hyperlink r:id="rId28">
+      <w:hyperlink r:id="rId33">
         <w:r>
           <w:rPr>
             <w:color w:val="0563C1"/>

</xml_diff>